<commit_message>
Insert Zenodo DOI into repository files
</commit_message>
<xml_diff>
--- a/manuscript/MSBP_Tg_Journal_Manuscript.docx
+++ b/manuscript/MSBP_Tg_Journal_Manuscript.docx
@@ -6352,7 +6352,22 @@
         <w:jc w:val="both"/>
       </w:pPr>
       <w:r>
-        <w:t>Analysis code is provided in the accompanying public-safe reproducibility package, including src/msbp_tg, scripts, tests, environment files, metadata files, and public-safe derived summary tables. A DOI-resolved release should be generated through GitHub and Zenodo before ChemRxiv posting; after release, this statement should be replaced with the resolved software citation.</w:t>
+        <w:t>Analysis code and the public-safe reproducibility package are archived on GitHub and Zenodo.</w:t>
+      </w:r>
+    </w:p>
+    <w:p>
+      <w:r>
+        <w:t>GitHub repository: https://github.com/htetkokokonaing-dev/msbp-tg</w:t>
+      </w:r>
+    </w:p>
+    <w:p>
+      <w:r>
+        <w:t>Zenodo DOI: https://doi.org/10.5281/zenodo.21100020</w:t>
+      </w:r>
+    </w:p>
+    <w:p>
+      <w:r>
+        <w:t>The repository includes src/msbp_tg, scripts, tests, environment files, metadata files, aggregate validation summaries, figures, and public-safe derived tables. Raw third-party datasets and row-level third-party-derived SMILES/Tg records are not redistributed.</w:t>
       </w:r>
     </w:p>
     <w:p>

</xml_diff>